<commit_message>
Colour code writing reviews across app and worksheet
</commit_message>
<xml_diff>
--- a/public/resources/writing-review-template.docx
+++ b/public/resources/writing-review-template.docx
@@ -13,6 +13,41 @@
     <w:p>
       <w:r>
         <w:t>Use this worksheet for a school writing task. Keep the original beside your new version. Answer in the app or fill this file in and upload it to My documents. A parent may help with the file, but the new sentences should be the student’s own.</w:t>
+      </w:r>
+    </w:p>
+    <w:p>
+      <w:pPr>
+        <w:spacing w:after="160"/>
+      </w:pPr>
+      <w:r>
+        <w:rPr>
+          <w:b/>
+          <w:color w:val="AC2929"/>
+        </w:rPr>
+        <w:t>Red</w:t>
+      </w:r>
+      <w:r>
+        <w:t xml:space="preserve"> = original wording to revisit   </w:t>
+      </w:r>
+      <w:r>
+        <w:rPr>
+          <w:b/>
+          <w:color w:val="18703F"/>
+        </w:rPr>
+        <w:t>Green</w:t>
+      </w:r>
+      <w:r>
+        <w:t xml:space="preserve"> = a correction   </w:t>
+      </w:r>
+      <w:r>
+        <w:rPr>
+          <w:b/>
+          <w:color w:val="2452A6"/>
+        </w:rPr>
+        <w:t>Blue</w:t>
+      </w:r>
+      <w:r>
+        <w:t xml:space="preserve"> = an optional stronger version</w:t>
       </w:r>
     </w:p>
     <w:p>
@@ -129,54 +164,117 @@
         <w:pStyle w:val="Heading1"/>
       </w:pPr>
       <w:r>
-        <w:t>Make small corrections</w:t>
+        <w:t>Compare sentences and make small corrections</w:t>
       </w:r>
     </w:p>
     <w:p>
       <w:r>
-        <w:t>Choose up to five changes that will help you most.</w:t>
+        <w:t>Choose up to five useful changes. Add an optional stronger version only when it helps. Use the comment column to explain the change.</w:t>
       </w:r>
     </w:p>
     <w:tbl>
       <w:tblPr>
-        <w:tblStyle w:val="LightShading-Accent1"/>
+        <w:tblStyle w:val="TableGrid"/>
         <w:tblW w:type="auto" w:w="0"/>
         <w:jc w:val="center"/>
+        <w:tblLayout w:type="fixed"/>
         <w:tblLook w:firstColumn="1" w:firstRow="1" w:lastColumn="0" w:lastRow="0" w:noHBand="0" w:noVBand="1" w:val="04A0"/>
       </w:tblPr>
       <w:tblGrid>
-        <w:gridCol w:w="3360"/>
-        <w:gridCol w:w="3360"/>
-        <w:gridCol w:w="3360"/>
+        <w:gridCol w:w="2059"/>
+        <w:gridCol w:w="2059"/>
+        <w:gridCol w:w="2246"/>
+        <w:gridCol w:w="2131"/>
       </w:tblGrid>
       <w:tr>
+        <w:trPr>
+          <w:tblHeader w:val="true"/>
+        </w:trPr>
         <w:tc>
           <w:tcPr>
-            <w:tcW w:type="dxa" w:w="3360"/>
+            <w:tcW w:type="dxa" w:w="2059"/>
+            <w:shd w:fill="253B75"/>
+            <w:vAlign w:val="top"/>
           </w:tcPr>
           <w:p>
+            <w:pPr>
+              <w:spacing w:after="0" w:line="257" w:lineRule="auto"/>
+            </w:pPr>
             <w:r>
-              <w:t>My original words</w:t>
+              <w:rPr>
+                <w:rFonts w:ascii="Aptos" w:hAnsi="Aptos"/>
+                <w:b/>
+                <w:i w:val="0"/>
+                <w:color w:val="FFFFFF"/>
+                <w:sz w:val="16"/>
+              </w:rPr>
+              <w:t>Original</w:t>
             </w:r>
           </w:p>
         </w:tc>
         <w:tc>
           <w:tcPr>
-            <w:tcW w:type="dxa" w:w="3360"/>
+            <w:tcW w:type="dxa" w:w="2059"/>
+            <w:shd w:fill="253B75"/>
+            <w:vAlign w:val="top"/>
           </w:tcPr>
           <w:p>
+            <w:pPr>
+              <w:spacing w:after="0" w:line="257" w:lineRule="auto"/>
+            </w:pPr>
             <w:r>
-              <w:t>A correction</w:t>
+              <w:rPr>
+                <w:rFonts w:ascii="Aptos" w:hAnsi="Aptos"/>
+                <w:b/>
+                <w:i w:val="0"/>
+                <w:color w:val="FFFFFF"/>
+                <w:sz w:val="16"/>
+              </w:rPr>
+              <w:t>Corrected</w:t>
             </w:r>
           </w:p>
         </w:tc>
         <w:tc>
           <w:tcPr>
-            <w:tcW w:type="dxa" w:w="3360"/>
+            <w:tcW w:type="dxa" w:w="2246"/>
+            <w:shd w:fill="253B75"/>
+            <w:vAlign w:val="top"/>
           </w:tcPr>
           <w:p>
+            <w:pPr>
+              <w:spacing w:after="0" w:line="257" w:lineRule="auto"/>
+            </w:pPr>
             <w:r>
-              <w:t>Why it helps</w:t>
+              <w:rPr>
+                <w:rFonts w:ascii="Aptos" w:hAnsi="Aptos"/>
+                <w:b/>
+                <w:i w:val="0"/>
+                <w:color w:val="FFFFFF"/>
+                <w:sz w:val="16"/>
+              </w:rPr>
+              <w:t>Improved</w:t>
+            </w:r>
+          </w:p>
+        </w:tc>
+        <w:tc>
+          <w:tcPr>
+            <w:tcW w:type="dxa" w:w="2131"/>
+            <w:shd w:fill="253B75"/>
+            <w:vAlign w:val="top"/>
+          </w:tcPr>
+          <w:p>
+            <w:pPr>
+              <w:spacing w:after="0" w:line="257" w:lineRule="auto"/>
+            </w:pPr>
+            <w:r>
+              <w:rPr>
+                <w:rFonts w:ascii="Aptos" w:hAnsi="Aptos"/>
+                <w:b/>
+                <w:i w:val="0"/>
+                <w:color w:val="FFFFFF"/>
+                <w:sz w:val="16"/>
+              </w:rPr>
+              <w:t>Comment</w:t>
             </w:r>
           </w:p>
         </w:tc>
@@ -184,130 +282,430 @@
       <w:tr>
         <w:tc>
           <w:tcPr>
-            <w:tcW w:type="dxa" w:w="3360"/>
+            <w:tcW w:type="dxa" w:w="2059"/>
+            <w:shd w:fill="FFF5F5"/>
+            <w:vAlign w:val="top"/>
           </w:tcPr>
           <w:p>
-            <w:r/>
+            <w:pPr>
+              <w:spacing w:after="0" w:line="257" w:lineRule="auto"/>
+            </w:pPr>
+            <w:r>
+              <w:rPr>
+                <w:rFonts w:ascii="Aptos" w:hAnsi="Aptos"/>
+                <w:b/>
+                <w:i w:val="0"/>
+                <w:color w:val="AC2929"/>
+                <w:sz w:val="16"/>
+              </w:rPr>
+            </w:r>
           </w:p>
         </w:tc>
         <w:tc>
           <w:tcPr>
-            <w:tcW w:type="dxa" w:w="3360"/>
+            <w:tcW w:type="dxa" w:w="2059"/>
+            <w:shd w:fill="F3FBF4"/>
+            <w:vAlign w:val="top"/>
           </w:tcPr>
           <w:p>
-            <w:r/>
+            <w:pPr>
+              <w:spacing w:after="0" w:line="257" w:lineRule="auto"/>
+            </w:pPr>
+            <w:r>
+              <w:rPr>
+                <w:rFonts w:ascii="Aptos" w:hAnsi="Aptos"/>
+                <w:b/>
+                <w:i w:val="0"/>
+                <w:color w:val="18703F"/>
+                <w:sz w:val="16"/>
+              </w:rPr>
+            </w:r>
           </w:p>
         </w:tc>
         <w:tc>
           <w:tcPr>
-            <w:tcW w:type="dxa" w:w="3360"/>
+            <w:tcW w:type="dxa" w:w="2246"/>
+            <w:shd w:fill="F1F6FF"/>
+            <w:vAlign w:val="top"/>
           </w:tcPr>
           <w:p>
-            <w:r/>
+            <w:pPr>
+              <w:spacing w:after="0" w:line="257" w:lineRule="auto"/>
+            </w:pPr>
+            <w:r>
+              <w:rPr>
+                <w:rFonts w:ascii="Aptos" w:hAnsi="Aptos"/>
+                <w:b/>
+                <w:i w:val="0"/>
+                <w:color w:val="2452A6"/>
+                <w:sz w:val="16"/>
+              </w:rPr>
+            </w:r>
+          </w:p>
+        </w:tc>
+        <w:tc>
+          <w:tcPr>
+            <w:tcW w:type="dxa" w:w="2131"/>
+            <w:shd w:fill="F7F8FA"/>
+            <w:vAlign w:val="top"/>
+          </w:tcPr>
+          <w:p>
+            <w:pPr>
+              <w:spacing w:after="0" w:line="257" w:lineRule="auto"/>
+            </w:pPr>
+            <w:r>
+              <w:rPr>
+                <w:rFonts w:ascii="Aptos" w:hAnsi="Aptos"/>
+                <w:b w:val="0"/>
+                <w:i/>
+                <w:color w:val="5A6270"/>
+                <w:sz w:val="16"/>
+              </w:rPr>
+            </w:r>
           </w:p>
         </w:tc>
       </w:tr>
       <w:tr>
         <w:tc>
           <w:tcPr>
-            <w:tcW w:type="dxa" w:w="3360"/>
+            <w:tcW w:type="dxa" w:w="2059"/>
+            <w:shd w:fill="FFF5F5"/>
+            <w:vAlign w:val="top"/>
           </w:tcPr>
           <w:p>
-            <w:r/>
+            <w:pPr>
+              <w:spacing w:after="0" w:line="257" w:lineRule="auto"/>
+            </w:pPr>
+            <w:r>
+              <w:rPr>
+                <w:rFonts w:ascii="Aptos" w:hAnsi="Aptos"/>
+                <w:b/>
+                <w:i w:val="0"/>
+                <w:color w:val="AC2929"/>
+                <w:sz w:val="16"/>
+              </w:rPr>
+            </w:r>
           </w:p>
         </w:tc>
         <w:tc>
           <w:tcPr>
-            <w:tcW w:type="dxa" w:w="3360"/>
+            <w:tcW w:type="dxa" w:w="2059"/>
+            <w:shd w:fill="F3FBF4"/>
+            <w:vAlign w:val="top"/>
           </w:tcPr>
           <w:p>
-            <w:r/>
+            <w:pPr>
+              <w:spacing w:after="0" w:line="257" w:lineRule="auto"/>
+            </w:pPr>
+            <w:r>
+              <w:rPr>
+                <w:rFonts w:ascii="Aptos" w:hAnsi="Aptos"/>
+                <w:b/>
+                <w:i w:val="0"/>
+                <w:color w:val="18703F"/>
+                <w:sz w:val="16"/>
+              </w:rPr>
+            </w:r>
           </w:p>
         </w:tc>
         <w:tc>
           <w:tcPr>
-            <w:tcW w:type="dxa" w:w="3360"/>
+            <w:tcW w:type="dxa" w:w="2246"/>
+            <w:shd w:fill="F1F6FF"/>
+            <w:vAlign w:val="top"/>
           </w:tcPr>
           <w:p>
-            <w:r/>
+            <w:pPr>
+              <w:spacing w:after="0" w:line="257" w:lineRule="auto"/>
+            </w:pPr>
+            <w:r>
+              <w:rPr>
+                <w:rFonts w:ascii="Aptos" w:hAnsi="Aptos"/>
+                <w:b/>
+                <w:i w:val="0"/>
+                <w:color w:val="2452A6"/>
+                <w:sz w:val="16"/>
+              </w:rPr>
+            </w:r>
+          </w:p>
+        </w:tc>
+        <w:tc>
+          <w:tcPr>
+            <w:tcW w:type="dxa" w:w="2131"/>
+            <w:shd w:fill="F7F8FA"/>
+            <w:vAlign w:val="top"/>
+          </w:tcPr>
+          <w:p>
+            <w:pPr>
+              <w:spacing w:after="0" w:line="257" w:lineRule="auto"/>
+            </w:pPr>
+            <w:r>
+              <w:rPr>
+                <w:rFonts w:ascii="Aptos" w:hAnsi="Aptos"/>
+                <w:b w:val="0"/>
+                <w:i/>
+                <w:color w:val="5A6270"/>
+                <w:sz w:val="16"/>
+              </w:rPr>
+            </w:r>
           </w:p>
         </w:tc>
       </w:tr>
       <w:tr>
         <w:tc>
           <w:tcPr>
-            <w:tcW w:type="dxa" w:w="3360"/>
+            <w:tcW w:type="dxa" w:w="2059"/>
+            <w:shd w:fill="FFF5F5"/>
+            <w:vAlign w:val="top"/>
           </w:tcPr>
           <w:p>
-            <w:r/>
+            <w:pPr>
+              <w:spacing w:after="0" w:line="257" w:lineRule="auto"/>
+            </w:pPr>
+            <w:r>
+              <w:rPr>
+                <w:rFonts w:ascii="Aptos" w:hAnsi="Aptos"/>
+                <w:b/>
+                <w:i w:val="0"/>
+                <w:color w:val="AC2929"/>
+                <w:sz w:val="16"/>
+              </w:rPr>
+            </w:r>
           </w:p>
         </w:tc>
         <w:tc>
           <w:tcPr>
-            <w:tcW w:type="dxa" w:w="3360"/>
+            <w:tcW w:type="dxa" w:w="2059"/>
+            <w:shd w:fill="F3FBF4"/>
+            <w:vAlign w:val="top"/>
           </w:tcPr>
           <w:p>
-            <w:r/>
+            <w:pPr>
+              <w:spacing w:after="0" w:line="257" w:lineRule="auto"/>
+            </w:pPr>
+            <w:r>
+              <w:rPr>
+                <w:rFonts w:ascii="Aptos" w:hAnsi="Aptos"/>
+                <w:b/>
+                <w:i w:val="0"/>
+                <w:color w:val="18703F"/>
+                <w:sz w:val="16"/>
+              </w:rPr>
+            </w:r>
           </w:p>
         </w:tc>
         <w:tc>
           <w:tcPr>
-            <w:tcW w:type="dxa" w:w="3360"/>
+            <w:tcW w:type="dxa" w:w="2246"/>
+            <w:shd w:fill="F1F6FF"/>
+            <w:vAlign w:val="top"/>
           </w:tcPr>
           <w:p>
-            <w:r/>
+            <w:pPr>
+              <w:spacing w:after="0" w:line="257" w:lineRule="auto"/>
+            </w:pPr>
+            <w:r>
+              <w:rPr>
+                <w:rFonts w:ascii="Aptos" w:hAnsi="Aptos"/>
+                <w:b/>
+                <w:i w:val="0"/>
+                <w:color w:val="2452A6"/>
+                <w:sz w:val="16"/>
+              </w:rPr>
+            </w:r>
+          </w:p>
+        </w:tc>
+        <w:tc>
+          <w:tcPr>
+            <w:tcW w:type="dxa" w:w="2131"/>
+            <w:shd w:fill="F7F8FA"/>
+            <w:vAlign w:val="top"/>
+          </w:tcPr>
+          <w:p>
+            <w:pPr>
+              <w:spacing w:after="0" w:line="257" w:lineRule="auto"/>
+            </w:pPr>
+            <w:r>
+              <w:rPr>
+                <w:rFonts w:ascii="Aptos" w:hAnsi="Aptos"/>
+                <w:b w:val="0"/>
+                <w:i/>
+                <w:color w:val="5A6270"/>
+                <w:sz w:val="16"/>
+              </w:rPr>
+            </w:r>
           </w:p>
         </w:tc>
       </w:tr>
       <w:tr>
         <w:tc>
           <w:tcPr>
-            <w:tcW w:type="dxa" w:w="3360"/>
+            <w:tcW w:type="dxa" w:w="2059"/>
+            <w:shd w:fill="FFF5F5"/>
+            <w:vAlign w:val="top"/>
           </w:tcPr>
           <w:p>
-            <w:r/>
+            <w:pPr>
+              <w:spacing w:after="0" w:line="257" w:lineRule="auto"/>
+            </w:pPr>
+            <w:r>
+              <w:rPr>
+                <w:rFonts w:ascii="Aptos" w:hAnsi="Aptos"/>
+                <w:b/>
+                <w:i w:val="0"/>
+                <w:color w:val="AC2929"/>
+                <w:sz w:val="16"/>
+              </w:rPr>
+            </w:r>
           </w:p>
         </w:tc>
         <w:tc>
           <w:tcPr>
-            <w:tcW w:type="dxa" w:w="3360"/>
+            <w:tcW w:type="dxa" w:w="2059"/>
+            <w:shd w:fill="F3FBF4"/>
+            <w:vAlign w:val="top"/>
           </w:tcPr>
           <w:p>
-            <w:r/>
+            <w:pPr>
+              <w:spacing w:after="0" w:line="257" w:lineRule="auto"/>
+            </w:pPr>
+            <w:r>
+              <w:rPr>
+                <w:rFonts w:ascii="Aptos" w:hAnsi="Aptos"/>
+                <w:b/>
+                <w:i w:val="0"/>
+                <w:color w:val="18703F"/>
+                <w:sz w:val="16"/>
+              </w:rPr>
+            </w:r>
           </w:p>
         </w:tc>
         <w:tc>
           <w:tcPr>
-            <w:tcW w:type="dxa" w:w="3360"/>
+            <w:tcW w:type="dxa" w:w="2246"/>
+            <w:shd w:fill="F1F6FF"/>
+            <w:vAlign w:val="top"/>
           </w:tcPr>
           <w:p>
-            <w:r/>
+            <w:pPr>
+              <w:spacing w:after="0" w:line="257" w:lineRule="auto"/>
+            </w:pPr>
+            <w:r>
+              <w:rPr>
+                <w:rFonts w:ascii="Aptos" w:hAnsi="Aptos"/>
+                <w:b/>
+                <w:i w:val="0"/>
+                <w:color w:val="2452A6"/>
+                <w:sz w:val="16"/>
+              </w:rPr>
+            </w:r>
+          </w:p>
+        </w:tc>
+        <w:tc>
+          <w:tcPr>
+            <w:tcW w:type="dxa" w:w="2131"/>
+            <w:shd w:fill="F7F8FA"/>
+            <w:vAlign w:val="top"/>
+          </w:tcPr>
+          <w:p>
+            <w:pPr>
+              <w:spacing w:after="0" w:line="257" w:lineRule="auto"/>
+            </w:pPr>
+            <w:r>
+              <w:rPr>
+                <w:rFonts w:ascii="Aptos" w:hAnsi="Aptos"/>
+                <w:b w:val="0"/>
+                <w:i/>
+                <w:color w:val="5A6270"/>
+                <w:sz w:val="16"/>
+              </w:rPr>
+            </w:r>
           </w:p>
         </w:tc>
       </w:tr>
       <w:tr>
         <w:tc>
           <w:tcPr>
-            <w:tcW w:type="dxa" w:w="3360"/>
+            <w:tcW w:type="dxa" w:w="2059"/>
+            <w:shd w:fill="FFF5F5"/>
+            <w:vAlign w:val="top"/>
           </w:tcPr>
           <w:p>
-            <w:r/>
+            <w:pPr>
+              <w:spacing w:after="0" w:line="257" w:lineRule="auto"/>
+            </w:pPr>
+            <w:r>
+              <w:rPr>
+                <w:rFonts w:ascii="Aptos" w:hAnsi="Aptos"/>
+                <w:b/>
+                <w:i w:val="0"/>
+                <w:color w:val="AC2929"/>
+                <w:sz w:val="16"/>
+              </w:rPr>
+            </w:r>
           </w:p>
         </w:tc>
         <w:tc>
           <w:tcPr>
-            <w:tcW w:type="dxa" w:w="3360"/>
+            <w:tcW w:type="dxa" w:w="2059"/>
+            <w:shd w:fill="F3FBF4"/>
+            <w:vAlign w:val="top"/>
           </w:tcPr>
           <w:p>
-            <w:r/>
+            <w:pPr>
+              <w:spacing w:after="0" w:line="257" w:lineRule="auto"/>
+            </w:pPr>
+            <w:r>
+              <w:rPr>
+                <w:rFonts w:ascii="Aptos" w:hAnsi="Aptos"/>
+                <w:b/>
+                <w:i w:val="0"/>
+                <w:color w:val="18703F"/>
+                <w:sz w:val="16"/>
+              </w:rPr>
+            </w:r>
           </w:p>
         </w:tc>
         <w:tc>
           <w:tcPr>
-            <w:tcW w:type="dxa" w:w="3360"/>
+            <w:tcW w:type="dxa" w:w="2246"/>
+            <w:shd w:fill="F1F6FF"/>
+            <w:vAlign w:val="top"/>
           </w:tcPr>
           <w:p>
-            <w:r/>
+            <w:pPr>
+              <w:spacing w:after="0" w:line="257" w:lineRule="auto"/>
+            </w:pPr>
+            <w:r>
+              <w:rPr>
+                <w:rFonts w:ascii="Aptos" w:hAnsi="Aptos"/>
+                <w:b/>
+                <w:i w:val="0"/>
+                <w:color w:val="2452A6"/>
+                <w:sz w:val="16"/>
+              </w:rPr>
+            </w:r>
+          </w:p>
+        </w:tc>
+        <w:tc>
+          <w:tcPr>
+            <w:tcW w:type="dxa" w:w="2131"/>
+            <w:shd w:fill="F7F8FA"/>
+            <w:vAlign w:val="top"/>
+          </w:tcPr>
+          <w:p>
+            <w:pPr>
+              <w:spacing w:after="0" w:line="257" w:lineRule="auto"/>
+            </w:pPr>
+            <w:r>
+              <w:rPr>
+                <w:rFonts w:ascii="Aptos" w:hAnsi="Aptos"/>
+                <w:b w:val="0"/>
+                <w:i/>
+                <w:color w:val="5A6270"/>
+                <w:sz w:val="16"/>
+              </w:rPr>
+            </w:r>
           </w:p>
         </w:tc>
       </w:tr>

</xml_diff>